<commit_message>
fix: monospace font for code blocks in preview & Word; remove image captions
</commit_message>
<xml_diff>
--- a/word_reference.docx
+++ b/word_reference.docx
@@ -923,6 +923,15 @@
       <w:szCs w:val="22"/>
     </w:rPr>
   </w:style>
+  <w:style w:type="character" w:customStyle="1" w:styleId="VerbatimChar">
+    <w:name w:val="Verbatim Char"/>
+    <w:basedOn w:val="10"/>
+    <w:qFormat/>
+    <w:rPr>
+      <w:rFonts w:ascii="Consolas" w:hAnsi="Consolas" w:cs="Consolas"/>
+      <w:sz w:val="21"/>
+    </w:rPr>
+  </w:style>
 </w:styles>
 </file>
 

</xml_diff>